<commit_message>
chore: update test document
Co-Authored-By: Claude Opus 4.7 <noreply@anthropic.com>
</commit_message>
<xml_diff>
--- a/docs/租车服务标准合同-测试.docx
+++ b/docs/租车服务标准合同-测试.docx
@@ -32,29 +32,58 @@
           <w:lang w:eastAsia="zh-CN"/>
         </w:rPr>
       </w:pPr>
-      <w:permStart w:id="0" w:edGrp="everyone"/>
-      <w:r>
-        <w:rPr>
-          <w:highlight w:val="yellow"/>
-          <w:lang w:eastAsia="zh-CN"/>
-        </w:rPr>
-        <w:t>甲方（出租方）：____________________________________</w:t>
-      </w:r>
-    </w:p>
-    <w:p>
-      <w:pPr>
-        <w:pStyle w:val="9"/>
-        <w:rPr>
-          <w:highlight w:val="yellow"/>
-          <w:lang w:eastAsia="zh-CN"/>
-        </w:rPr>
-      </w:pPr>
-      <w:r>
-        <w:rPr>
-          <w:highlight w:val="yellow"/>
-          <w:lang w:eastAsia="zh-CN"/>
-        </w:rPr>
-        <w:t>统一社会信用代码/身份证号：________________________</w:t>
+      <w:r>
+        <w:rPr>
+          <w:highlight w:val="yellow"/>
+          <w:lang w:eastAsia="zh-CN"/>
+        </w:rPr>
+        <w:t>甲方（出租方）：_____________</w:t>
+      </w:r>
+      <w:r>
+        <w:rPr>
+          <w:rFonts w:hint="eastAsia"/>
+          <w:highlight w:val="yellow"/>
+          <w:lang w:val="en-US" w:eastAsia="zh-CN"/>
+        </w:rPr>
+        <w:t>神州行</w:t>
+      </w:r>
+      <w:r>
+        <w:rPr>
+          <w:highlight w:val="yellow"/>
+          <w:lang w:eastAsia="zh-CN"/>
+        </w:rPr>
+        <w:t>_______________________</w:t>
+      </w:r>
+    </w:p>
+    <w:p>
+      <w:pPr>
+        <w:pStyle w:val="9"/>
+        <w:rPr>
+          <w:highlight w:val="yellow"/>
+          <w:lang w:eastAsia="zh-CN"/>
+        </w:rPr>
+      </w:pPr>
+      <w:r>
+        <w:rPr>
+          <w:highlight w:val="yellow"/>
+          <w:lang w:eastAsia="zh-CN"/>
+        </w:rPr>
+        <w:t>统一社会信用代码/身份证号：_________</w:t>
+      </w:r>
+      <w:r>
+        <w:rPr>
+          <w:rFonts w:hint="eastAsia"/>
+          <w:highlight w:val="yellow"/>
+          <w:lang w:val="en-US" w:eastAsia="zh-CN"/>
+        </w:rPr>
+        <w:t>1243546</w:t>
+      </w:r>
+      <w:r>
+        <w:rPr>
+          <w:highlight w:val="yellow"/>
+          <w:lang w:eastAsia="zh-CN"/>
+        </w:rPr>
+        <w:t>_______________</w:t>
       </w:r>
     </w:p>
     <w:p>
@@ -70,7 +99,22 @@
           <w:highlight w:val="cyan"/>
           <w:lang w:eastAsia="zh-CN"/>
         </w:rPr>
-        <w:t>住所：__________________________________</w:t>
+        <w:t>住所：____________</w:t>
+      </w:r>
+      <w:r>
+        <w:rPr>
+          <w:rFonts w:hint="eastAsia"/>
+          <w:highlight w:val="cyan"/>
+          <w:lang w:val="en-US" w:eastAsia="zh-CN"/>
+        </w:rPr>
+        <w:t>重庆</w:t>
+      </w:r>
+      <w:r>
+        <w:rPr>
+          <w:highlight w:val="cyan"/>
+          <w:lang w:eastAsia="zh-CN"/>
+        </w:rPr>
+        <w:t>______________________</w:t>
       </w:r>
     </w:p>
     <w:p>
@@ -86,7 +130,22 @@
           <w:highlight w:val="cyan"/>
           <w:lang w:eastAsia="zh-CN"/>
         </w:rPr>
-        <w:t>法定代表人/负责人：______________________</w:t>
+        <w:t>法定代表人/负责人：_________</w:t>
+      </w:r>
+      <w:r>
+        <w:rPr>
+          <w:rFonts w:hint="eastAsia"/>
+          <w:highlight w:val="cyan"/>
+          <w:lang w:val="en-US" w:eastAsia="zh-CN"/>
+        </w:rPr>
+        <w:t>张三</w:t>
+      </w:r>
+      <w:r>
+        <w:rPr>
+          <w:highlight w:val="cyan"/>
+          <w:lang w:eastAsia="zh-CN"/>
+        </w:rPr>
+        <w:t>_____________</w:t>
       </w:r>
     </w:p>
     <w:p>
@@ -100,7 +159,20 @@
         <w:rPr>
           <w:lang w:eastAsia="zh-CN"/>
         </w:rPr>
-        <w:t>联系电话：______________________________</w:t>
+        <w:t>联系电话：____________</w:t>
+      </w:r>
+      <w:r>
+        <w:rPr>
+          <w:rFonts w:hint="eastAsia"/>
+          <w:lang w:val="en-US" w:eastAsia="zh-CN"/>
+        </w:rPr>
+        <w:t>1234352534</w:t>
+      </w:r>
+      <w:r>
+        <w:rPr>
+          <w:lang w:eastAsia="zh-CN"/>
+        </w:rPr>
+        <w:t>__________________</w:t>
       </w:r>
     </w:p>
     <w:p>
@@ -114,110 +186,195 @@
         <w:rPr>
           <w:lang w:eastAsia="zh-CN"/>
         </w:rPr>
+        <w:t>电子邮箱：___________</w:t>
+      </w:r>
+      <w:r>
+        <w:rPr>
+          <w:rFonts w:hint="eastAsia"/>
+          <w:lang w:val="en-US" w:eastAsia="zh-CN"/>
+        </w:rPr>
+        <w:t>12746363635@qq.com</w:t>
+      </w:r>
+      <w:r>
+        <w:rPr>
+          <w:lang w:eastAsia="zh-CN"/>
+        </w:rPr>
+        <w:t>___________________</w:t>
+      </w:r>
+    </w:p>
+    <w:p>
+      <w:pPr>
+        <w:rPr>
+          <w:highlight w:val="yellow"/>
+          <w:lang w:eastAsia="zh-CN"/>
+        </w:rPr>
+      </w:pPr>
+    </w:p>
+    <w:p>
+      <w:pPr>
+        <w:pStyle w:val="9"/>
+        <w:rPr>
+          <w:highlight w:val="yellow"/>
+          <w:lang w:eastAsia="zh-CN"/>
+        </w:rPr>
+      </w:pPr>
+      <w:r>
+        <w:rPr>
+          <w:highlight w:val="yellow"/>
+          <w:lang w:eastAsia="zh-CN"/>
+        </w:rPr>
+        <w:t>乙方（承租方）：___________</w:t>
+      </w:r>
+      <w:r>
+        <w:rPr>
+          <w:rFonts w:hint="eastAsia"/>
+          <w:highlight w:val="yellow"/>
+          <w:lang w:val="en-US" w:eastAsia="zh-CN"/>
+        </w:rPr>
+        <w:t>李四</w:t>
+      </w:r>
+      <w:r>
+        <w:rPr>
+          <w:highlight w:val="yellow"/>
+          <w:lang w:eastAsia="zh-CN"/>
+        </w:rPr>
+        <w:t>_________________________</w:t>
+      </w:r>
+    </w:p>
+    <w:p>
+      <w:pPr>
+        <w:pStyle w:val="9"/>
+        <w:rPr>
+          <w:highlight w:val="yellow"/>
+          <w:lang w:eastAsia="zh-CN"/>
+        </w:rPr>
+      </w:pPr>
+      <w:r>
+        <w:rPr>
+          <w:highlight w:val="yellow"/>
+          <w:lang w:eastAsia="zh-CN"/>
+        </w:rPr>
+        <w:t>统一社会信用代码/身份证号：_________</w:t>
+      </w:r>
+      <w:r>
+        <w:rPr>
+          <w:rFonts w:hint="eastAsia"/>
+          <w:highlight w:val="yellow"/>
+          <w:lang w:val="en-US" w:eastAsia="zh-CN"/>
+        </w:rPr>
+        <w:t>1837365534</w:t>
+      </w:r>
+      <w:r>
+        <w:rPr>
+          <w:highlight w:val="yellow"/>
+          <w:lang w:eastAsia="zh-CN"/>
+        </w:rPr>
+        <w:t>_______________</w:t>
+      </w:r>
+    </w:p>
+    <w:p>
+      <w:pPr>
+        <w:ind w:firstLine="480" w:firstLineChars="200"/>
+        <w:rPr>
+          <w:highlight w:val="cyan"/>
+          <w:lang w:eastAsia="zh-CN"/>
+        </w:rPr>
+      </w:pPr>
+      <w:r>
+        <w:rPr>
+          <w:highlight w:val="cyan"/>
+          <w:lang w:eastAsia="zh-CN"/>
+        </w:rPr>
+        <w:t>住所：______________</w:t>
+      </w:r>
+      <w:r>
+        <w:rPr>
+          <w:rFonts w:hint="eastAsia"/>
+          <w:highlight w:val="cyan"/>
+          <w:lang w:val="en-US" w:eastAsia="zh-CN"/>
+        </w:rPr>
+        <w:t>阿萨德就发货</w:t>
+      </w:r>
+      <w:r>
+        <w:rPr>
+          <w:highlight w:val="cyan"/>
+          <w:lang w:eastAsia="zh-CN"/>
+        </w:rPr>
+        <w:t>____________________</w:t>
+      </w:r>
+    </w:p>
+    <w:p>
+      <w:pPr>
+        <w:ind w:firstLine="480" w:firstLineChars="200"/>
+        <w:rPr>
+          <w:highlight w:val="cyan"/>
+          <w:lang w:eastAsia="zh-CN"/>
+        </w:rPr>
+      </w:pPr>
+      <w:r>
+        <w:rPr>
+          <w:highlight w:val="cyan"/>
+          <w:lang w:eastAsia="zh-CN"/>
+        </w:rPr>
+        <w:t>法定代表人/负责人：________</w:t>
+      </w:r>
+      <w:r>
+        <w:rPr>
+          <w:rFonts w:hint="eastAsia"/>
+          <w:highlight w:val="cyan"/>
+          <w:lang w:val="en-US" w:eastAsia="zh-CN"/>
+        </w:rPr>
+        <w:t>王五</w:t>
+      </w:r>
+      <w:r>
+        <w:rPr>
+          <w:highlight w:val="cyan"/>
+          <w:lang w:eastAsia="zh-CN"/>
+        </w:rPr>
+        <w:t>______________</w:t>
+      </w:r>
+    </w:p>
+    <w:p>
+      <w:pPr>
+        <w:ind w:firstLine="480" w:firstLineChars="200"/>
+        <w:rPr>
+          <w:lang w:eastAsia="zh-CN"/>
+        </w:rPr>
+      </w:pPr>
+      <w:r>
+        <w:rPr>
+          <w:lang w:eastAsia="zh-CN"/>
+        </w:rPr>
+        <w:t>联系电话：_________</w:t>
+      </w:r>
+      <w:r>
+        <w:rPr>
+          <w:rFonts w:hint="eastAsia"/>
+          <w:lang w:val="en-US" w:eastAsia="zh-CN"/>
+        </w:rPr>
+        <w:t>139486</w:t>
+      </w:r>
+      <w:r>
+        <w:rPr>
+          <w:lang w:eastAsia="zh-CN"/>
+        </w:rPr>
+        <w:t>_____________________</w:t>
+      </w:r>
+    </w:p>
+    <w:p>
+      <w:pPr>
+        <w:ind w:firstLine="480" w:firstLineChars="200"/>
+        <w:rPr>
+          <w:lang w:eastAsia="zh-CN"/>
+        </w:rPr>
+      </w:pPr>
+      <w:r>
+        <w:rPr>
+          <w:lang w:eastAsia="zh-CN"/>
+        </w:rPr>
         <w:t>电子邮箱：______________________________</w:t>
       </w:r>
     </w:p>
-    <w:p>
-      <w:pPr>
-        <w:rPr>
-          <w:highlight w:val="yellow"/>
-          <w:lang w:eastAsia="zh-CN"/>
-        </w:rPr>
-      </w:pPr>
-    </w:p>
-    <w:p>
-      <w:pPr>
-        <w:pStyle w:val="9"/>
-        <w:rPr>
-          <w:highlight w:val="yellow"/>
-          <w:lang w:eastAsia="zh-CN"/>
-        </w:rPr>
-      </w:pPr>
-      <w:r>
-        <w:rPr>
-          <w:highlight w:val="yellow"/>
-          <w:lang w:eastAsia="zh-CN"/>
-        </w:rPr>
-        <w:t>乙方（承租方）：____________________________________</w:t>
-      </w:r>
-    </w:p>
-    <w:p>
-      <w:pPr>
-        <w:pStyle w:val="9"/>
-        <w:rPr>
-          <w:highlight w:val="yellow"/>
-          <w:lang w:eastAsia="zh-CN"/>
-        </w:rPr>
-      </w:pPr>
-      <w:r>
-        <w:rPr>
-          <w:highlight w:val="yellow"/>
-          <w:lang w:eastAsia="zh-CN"/>
-        </w:rPr>
-        <w:t>统一社会信用代码/身份证号：________________________</w:t>
-      </w:r>
-    </w:p>
-    <w:p>
-      <w:pPr>
-        <w:ind w:firstLine="480" w:firstLineChars="200"/>
-        <w:rPr>
-          <w:highlight w:val="cyan"/>
-          <w:lang w:eastAsia="zh-CN"/>
-        </w:rPr>
-      </w:pPr>
-      <w:r>
-        <w:rPr>
-          <w:highlight w:val="cyan"/>
-          <w:lang w:eastAsia="zh-CN"/>
-        </w:rPr>
-        <w:t>住所：__________________________________</w:t>
-      </w:r>
-    </w:p>
-    <w:p>
-      <w:pPr>
-        <w:ind w:firstLine="480" w:firstLineChars="200"/>
-        <w:rPr>
-          <w:highlight w:val="cyan"/>
-          <w:lang w:eastAsia="zh-CN"/>
-        </w:rPr>
-      </w:pPr>
-      <w:r>
-        <w:rPr>
-          <w:highlight w:val="cyan"/>
-          <w:lang w:eastAsia="zh-CN"/>
-        </w:rPr>
-        <w:t>法定代表人/负责人：______________________</w:t>
-      </w:r>
-    </w:p>
-    <w:p>
-      <w:pPr>
-        <w:ind w:firstLine="480" w:firstLineChars="200"/>
-        <w:rPr>
-          <w:lang w:eastAsia="zh-CN"/>
-        </w:rPr>
-      </w:pPr>
-      <w:r>
-        <w:rPr>
-          <w:lang w:eastAsia="zh-CN"/>
-        </w:rPr>
-        <w:t>联系电话：______________________________</w:t>
-      </w:r>
-    </w:p>
-    <w:p>
-      <w:pPr>
-        <w:ind w:firstLine="480" w:firstLineChars="200"/>
-        <w:rPr>
-          <w:lang w:eastAsia="zh-CN"/>
-        </w:rPr>
-      </w:pPr>
-      <w:r>
-        <w:rPr>
-          <w:lang w:eastAsia="zh-CN"/>
-        </w:rPr>
-        <w:t>电子邮箱：______________________________</w:t>
-      </w:r>
-    </w:p>
-    <w:permEnd w:id="0"/>
     <w:p>
       <w:pPr>
         <w:rPr>
@@ -276,7 +433,6 @@
           <w:lang w:eastAsia="zh-CN"/>
         </w:rPr>
       </w:pPr>
-      <w:permStart w:id="1" w:edGrp="everyone"/>
       <w:r>
         <w:rPr>
           <w:color w:val="000000"/>
@@ -322,7 +478,26 @@
           <w:highlight w:val="yellow"/>
           <w:lang w:eastAsia="zh-CN"/>
         </w:rPr>
-        <w:t>车牌号码：__________</w:t>
+        <w:t>车牌号码：___</w:t>
+      </w:r>
+      <w:r>
+        <w:rPr>
+          <w:rFonts w:hint="eastAsia"/>
+          <w:color w:val="000000"/>
+          <w:szCs w:val="24"/>
+          <w:highlight w:val="yellow"/>
+          <w:lang w:val="en-US" w:eastAsia="zh-CN"/>
+        </w:rPr>
+        <w:t>A8W273</w:t>
+      </w:r>
+      <w:r>
+        <w:rPr>
+          <w:color w:val="000000"/>
+          <w:szCs w:val="24"/>
+          <w:highlight w:val="yellow"/>
+          <w:lang w:eastAsia="zh-CN"/>
+        </w:rPr>
+        <w:t>_______</w:t>
       </w:r>
       <w:r>
         <w:rPr>
@@ -341,7 +516,7 @@
           <w:highlight w:val="cyan"/>
           <w:lang w:eastAsia="zh-CN"/>
         </w:rPr>
-        <w:t>车架号码：__________</w:t>
+        <w:t>车架号码：______</w:t>
       </w:r>
       <w:r>
         <w:rPr>
@@ -349,9 +524,9 @@
           <w:color w:val="000000"/>
           <w:szCs w:val="24"/>
           <w:highlight w:val="cyan"/>
-          <w:lang w:eastAsia="zh-CN"/>
-        </w:rPr>
-        <w:t>，</w:t>
+          <w:lang w:val="en-US" w:eastAsia="zh-CN"/>
+        </w:rPr>
+        <w:t>asdg</w:t>
       </w:r>
       <w:r>
         <w:rPr>
@@ -360,7 +535,7 @@
           <w:highlight w:val="cyan"/>
           <w:lang w:eastAsia="zh-CN"/>
         </w:rPr>
-        <w:t>车辆颜色：__________</w:t>
+        <w:t>____</w:t>
       </w:r>
       <w:r>
         <w:rPr>
@@ -379,16 +554,72 @@
           <w:highlight w:val="cyan"/>
           <w:lang w:eastAsia="zh-CN"/>
         </w:rPr>
-        <w:t>车辆状况：__________</w:t>
-      </w:r>
-    </w:p>
-    <w:permEnd w:id="1"/>
-    <w:p>
-      <w:pPr>
-        <w:spacing w:after="0" w:line="360" w:lineRule="atLeast"/>
-        <w:rPr>
+        <w:t>车辆颜色：_____</w:t>
+      </w:r>
+      <w:r>
+        <w:rPr>
+          <w:rFonts w:hint="eastAsia"/>
           <w:color w:val="000000"/>
           <w:szCs w:val="24"/>
+          <w:highlight w:val="cyan"/>
+          <w:lang w:val="en-US" w:eastAsia="zh-CN"/>
+        </w:rPr>
+        <w:t>白色</w:t>
+      </w:r>
+      <w:r>
+        <w:rPr>
+          <w:color w:val="000000"/>
+          <w:szCs w:val="24"/>
+          <w:highlight w:val="cyan"/>
+          <w:lang w:eastAsia="zh-CN"/>
+        </w:rPr>
+        <w:t>_____</w:t>
+      </w:r>
+      <w:r>
+        <w:rPr>
+          <w:rFonts w:hint="eastAsia"/>
+          <w:color w:val="000000"/>
+          <w:szCs w:val="24"/>
+          <w:highlight w:val="cyan"/>
+          <w:lang w:eastAsia="zh-CN"/>
+        </w:rPr>
+        <w:t>，</w:t>
+      </w:r>
+      <w:r>
+        <w:rPr>
+          <w:color w:val="000000"/>
+          <w:szCs w:val="24"/>
+          <w:highlight w:val="cyan"/>
+          <w:lang w:eastAsia="zh-CN"/>
+        </w:rPr>
+        <w:t>车辆状况：___</w:t>
+      </w:r>
+      <w:r>
+        <w:rPr>
+          <w:rFonts w:hint="eastAsia"/>
+          <w:color w:val="000000"/>
+          <w:szCs w:val="24"/>
+          <w:highlight w:val="cyan"/>
+          <w:lang w:val="en-US" w:eastAsia="zh-CN"/>
+        </w:rPr>
+        <w:t>良好</w:t>
+      </w:r>
+      <w:r>
+        <w:rPr>
+          <w:color w:val="000000"/>
+          <w:szCs w:val="24"/>
+          <w:highlight w:val="cyan"/>
+          <w:lang w:eastAsia="zh-CN"/>
+        </w:rPr>
+        <w:t>_______</w:t>
+      </w:r>
+    </w:p>
+    <w:p>
+      <w:pPr>
+        <w:spacing w:after="0" w:line="360" w:lineRule="atLeast"/>
+        <w:rPr>
+          <w:color w:val="000000"/>
+          <w:szCs w:val="24"/>
           <w:lang w:eastAsia="zh-CN"/>
         </w:rPr>
       </w:pPr>
@@ -428,13 +659,117 @@
           <w:lang w:eastAsia="zh-CN"/>
         </w:rPr>
       </w:pPr>
-      <w:permStart w:id="2" w:edGrp="everyone"/>
-      <w:r>
-        <w:rPr>
-          <w:highlight w:val="yellow"/>
-          <w:lang w:eastAsia="zh-CN"/>
-        </w:rPr>
-        <w:t>2.1 租赁期限自______年____月____日起至______年____月____日止，共计____个月。</w:t>
+      <w:r>
+        <w:rPr>
+          <w:highlight w:val="yellow"/>
+          <w:lang w:eastAsia="zh-CN"/>
+        </w:rPr>
+        <w:t>2.1 租赁期限自___</w:t>
+      </w:r>
+      <w:r>
+        <w:rPr>
+          <w:rFonts w:hint="eastAsia"/>
+          <w:highlight w:val="yellow"/>
+          <w:lang w:val="en-US" w:eastAsia="zh-CN"/>
+        </w:rPr>
+        <w:t>2023</w:t>
+      </w:r>
+      <w:r>
+        <w:rPr>
+          <w:highlight w:val="yellow"/>
+          <w:lang w:eastAsia="zh-CN"/>
+        </w:rPr>
+        <w:t>___年__</w:t>
+      </w:r>
+      <w:r>
+        <w:rPr>
+          <w:rFonts w:hint="eastAsia"/>
+          <w:highlight w:val="yellow"/>
+          <w:lang w:val="en-US" w:eastAsia="zh-CN"/>
+        </w:rPr>
+        <w:t>2</w:t>
+      </w:r>
+      <w:r>
+        <w:rPr>
+          <w:highlight w:val="yellow"/>
+          <w:lang w:eastAsia="zh-CN"/>
+        </w:rPr>
+        <w:t>__月__</w:t>
+      </w:r>
+      <w:r>
+        <w:rPr>
+          <w:rFonts w:hint="eastAsia"/>
+          <w:highlight w:val="yellow"/>
+          <w:lang w:val="en-US" w:eastAsia="zh-CN"/>
+        </w:rPr>
+        <w:t>1</w:t>
+      </w:r>
+      <w:r>
+        <w:rPr>
+          <w:highlight w:val="yellow"/>
+          <w:lang w:eastAsia="zh-CN"/>
+        </w:rPr>
+        <w:t>__日起至___</w:t>
+      </w:r>
+      <w:r>
+        <w:rPr>
+          <w:rFonts w:hint="eastAsia"/>
+          <w:highlight w:val="yellow"/>
+          <w:lang w:val="en-US" w:eastAsia="zh-CN"/>
+        </w:rPr>
+        <w:t>1234</w:t>
+      </w:r>
+      <w:r>
+        <w:rPr>
+          <w:highlight w:val="yellow"/>
+          <w:lang w:eastAsia="zh-CN"/>
+        </w:rPr>
+        <w:t>___年_</w:t>
+      </w:r>
+      <w:r>
+        <w:rPr>
+          <w:rFonts w:hint="eastAsia"/>
+          <w:highlight w:val="yellow"/>
+          <w:lang w:val="en-US" w:eastAsia="zh-CN"/>
+        </w:rPr>
+        <w:t>2</w:t>
+      </w:r>
+      <w:r>
+        <w:rPr>
+          <w:highlight w:val="yellow"/>
+          <w:lang w:eastAsia="zh-CN"/>
+        </w:rPr>
+        <w:t>___月__</w:t>
+      </w:r>
+      <w:r>
+        <w:rPr>
+          <w:rFonts w:hint="eastAsia"/>
+          <w:highlight w:val="yellow"/>
+          <w:lang w:val="en-US" w:eastAsia="zh-CN"/>
+        </w:rPr>
+        <w:t>4</w:t>
+      </w:r>
+      <w:r>
+        <w:rPr>
+          <w:highlight w:val="yellow"/>
+          <w:lang w:eastAsia="zh-CN"/>
+        </w:rPr>
+        <w:t>__日止，共计__</w:t>
+      </w:r>
+      <w:r>
+        <w:rPr>
+          <w:rFonts w:hint="eastAsia"/>
+          <w:highlight w:val="yellow"/>
+          <w:lang w:val="en-US" w:eastAsia="zh-CN"/>
+        </w:rPr>
+        <w:t>2</w:t>
+      </w:r>
+      <w:r>
+        <w:rPr>
+          <w:highlight w:val="yellow"/>
+          <w:lang w:eastAsia="zh-CN"/>
+        </w:rPr>
+        <w:t>__个月。</w:t>
       </w:r>
       <w:r>
         <w:rPr>
@@ -519,34 +854,39 @@
           <w:highlight w:val="cyan"/>
           <w:lang w:eastAsia="zh-CN"/>
         </w:rPr>
-        <w:t>办公、业务展业等非营运用途），不得将车辆用于营利性营运、违法犯罪活动及其他违反法</w:t>
-      </w:r>
-      <w:bookmarkStart w:id="0" w:name="_GoBack"/>
-      <w:bookmarkEnd w:id="0"/>
+        <w:t>办公、业务展业等非营运用途），不得将车辆用于营利性营运、违法犯罪活动及其他违反法律法规的用途。</w:t>
+      </w:r>
+    </w:p>
+    <w:p>
+      <w:pPr>
+        <w:pStyle w:val="9"/>
+        <w:rPr>
+          <w:lang w:eastAsia="zh-CN"/>
+        </w:rPr>
+      </w:pPr>
       <w:r>
         <w:rPr>
           <w:highlight w:val="cyan"/>
           <w:lang w:eastAsia="zh-CN"/>
         </w:rPr>
-        <w:t>律法规的用途。</w:t>
-      </w:r>
-    </w:p>
-    <w:p>
-      <w:pPr>
-        <w:pStyle w:val="9"/>
-        <w:rPr>
-          <w:lang w:eastAsia="zh-CN"/>
-        </w:rPr>
-      </w:pPr>
-      <w:r>
-        <w:rPr>
+        <w:t>2.3 车辆使用范围：________</w:t>
+      </w:r>
+      <w:r>
+        <w:rPr>
+          <w:rFonts w:hint="eastAsia"/>
           <w:highlight w:val="cyan"/>
-          <w:lang w:eastAsia="zh-CN"/>
-        </w:rPr>
-        <w:t>2.3 车辆使用范围：________________________，如需超出约定范围使用，应事先征得甲方书面同意。</w:t>
-      </w:r>
-    </w:p>
-    <w:permEnd w:id="2"/>
+          <w:lang w:val="en-US" w:eastAsia="zh-CN"/>
+        </w:rPr>
+        <w:t>阿斯顿发货</w:t>
+      </w:r>
+      <w:r>
+        <w:rPr>
+          <w:highlight w:val="cyan"/>
+          <w:lang w:eastAsia="zh-CN"/>
+        </w:rPr>
+        <w:t>________________，如需超出约定范围使用，应事先征得甲方书面同意。</w:t>
+      </w:r>
+    </w:p>
     <w:p>
       <w:pPr>
         <w:pStyle w:val="7"/>
@@ -568,26 +908,48 @@
           <w:lang w:eastAsia="zh-CN"/>
         </w:rPr>
       </w:pPr>
-      <w:permStart w:id="3" w:edGrp="everyone"/>
-      <w:r>
-        <w:rPr>
-          <w:highlight w:val="yellow"/>
-          <w:lang w:eastAsia="zh-CN"/>
-        </w:rPr>
-        <w:t>3.1 本合同项下车辆月租金为人民币______元（大写：____________元整）</w:t>
-      </w:r>
-      <w:r>
-        <w:rPr>
-          <w:lang w:eastAsia="zh-CN"/>
-        </w:rPr>
-        <w:t>。</w:t>
-      </w:r>
-      <w:permEnd w:id="3"/>
-      <w:r>
-        <w:rPr>
-          <w:lang w:eastAsia="zh-CN"/>
-        </w:rPr>
-        <w:t>租金不包含燃油费、停车费、过路过桥费、违章罚款等费用。</w:t>
+      <w:r>
+        <w:rPr>
+          <w:highlight w:val="yellow"/>
+          <w:lang w:eastAsia="zh-CN"/>
+        </w:rPr>
+        <w:t>3.1 本合同项下车辆月租金为人民币___</w:t>
+      </w:r>
+      <w:r>
+        <w:rPr>
+          <w:rFonts w:hint="eastAsia"/>
+          <w:highlight w:val="yellow"/>
+          <w:lang w:val="en-US" w:eastAsia="zh-CN"/>
+        </w:rPr>
+        <w:t>12</w:t>
+      </w:r>
+      <w:r>
+        <w:rPr>
+          <w:highlight w:val="yellow"/>
+          <w:lang w:eastAsia="zh-CN"/>
+        </w:rPr>
+        <w:t>___元（大写：_______</w:t>
+      </w:r>
+      <w:r>
+        <w:rPr>
+          <w:rFonts w:hint="eastAsia"/>
+          <w:highlight w:val="yellow"/>
+          <w:lang w:val="en-US" w:eastAsia="zh-CN"/>
+        </w:rPr>
+        <w:t>十二元</w:t>
+      </w:r>
+      <w:r>
+        <w:rPr>
+          <w:highlight w:val="yellow"/>
+          <w:lang w:eastAsia="zh-CN"/>
+        </w:rPr>
+        <w:t>_____元整）</w:t>
+      </w:r>
+      <w:r>
+        <w:rPr>
+          <w:lang w:eastAsia="zh-CN"/>
+        </w:rPr>
+        <w:t>。租金不包含燃油费、停车费、过路过桥费、违章罚款等费用。</w:t>
       </w:r>
     </w:p>
     <w:p>
@@ -679,7 +1041,6 @@
           <w:lang w:eastAsia="zh-CN"/>
         </w:rPr>
       </w:pPr>
-      <w:permStart w:id="4" w:edGrp="everyone"/>
       <w:r>
         <w:rPr>
           <w:highlight w:val="yellow"/>
@@ -719,7 +1080,6 @@
         <w:t>银行账号：____________________________________</w:t>
       </w:r>
     </w:p>
-    <w:permEnd w:id="4"/>
     <w:p>
       <w:pPr>
         <w:pStyle w:val="9"/>
@@ -759,7 +1119,15 @@
         <w:rPr>
           <w:lang w:eastAsia="zh-CN"/>
         </w:rPr>
-        <w:t>4.1 甲方承担费用：车辆保险费（交强险、车辆损失险、第三者责任险、不计免赔等）、车船使用税、车辆定期保养费、年检费、50公里范围内车辆抛锚急救费。</w:t>
+        <w:t>4.1 甲方承担费用：车辆保险费（交强险、车辆损失险、第三者责任险、不计免赔等）、车船使用税、车辆定期保养费、年检费、</w:t>
+      </w:r>
+      <w:bookmarkStart w:id="0" w:name="_GoBack"/>
+      <w:bookmarkEnd w:id="0"/>
+      <w:r>
+        <w:rPr>
+          <w:lang w:eastAsia="zh-CN"/>
+        </w:rPr>
+        <w:t>车辆抛锚急救费。</w:t>
       </w:r>
     </w:p>
     <w:p>
@@ -1398,7 +1766,7 @@
         <w:rPr>
           <w:lang w:eastAsia="zh-CN"/>
         </w:rPr>
-        <w:t>9.4 乙方逾期交还车辆的，每逾期一日，</w:t>
+        <w:t>9.4 乙方逾期交还车辆的，</w:t>
       </w:r>
       <w:r>
         <w:rPr>
@@ -1431,13 +1799,20 @@
           <w:rFonts w:hint="eastAsia"/>
           <w:lang w:eastAsia="zh-CN"/>
         </w:rPr>
-        <w:t>，日租金标准为月租金÷3</w:t>
-      </w:r>
-      <w:r>
-        <w:rPr>
-          <w:lang w:eastAsia="zh-CN"/>
-        </w:rPr>
-        <w:t>0。</w:t>
+        <w:t>，日租金标准为月租金÷</w:t>
+      </w:r>
+      <w:r>
+        <w:rPr>
+          <w:rFonts w:hint="eastAsia"/>
+          <w:lang w:val="en-US" w:eastAsia="zh-CN"/>
+        </w:rPr>
+        <w:t>21</w:t>
+      </w:r>
+      <w:r>
+        <w:rPr>
+          <w:lang w:eastAsia="zh-CN"/>
+        </w:rPr>
+        <w:t>。</w:t>
       </w:r>
     </w:p>
     <w:p>
@@ -1493,7 +1868,20 @@
         <w:rPr>
           <w:lang w:eastAsia="zh-CN"/>
         </w:rPr>
-        <w:t>（1）逾期支付租金超过10日的；</w:t>
+        <w:t>（1）逾期支付租金超过</w:t>
+      </w:r>
+      <w:r>
+        <w:rPr>
+          <w:rFonts w:hint="eastAsia"/>
+          <w:lang w:val="en-US" w:eastAsia="zh-CN"/>
+        </w:rPr>
+        <w:t>5</w:t>
+      </w:r>
+      <w:r>
+        <w:rPr>
+          <w:lang w:eastAsia="zh-CN"/>
+        </w:rPr>
+        <w:t>日的；</w:t>
       </w:r>
     </w:p>
     <w:p>
@@ -1629,7 +2017,6 @@
           <w:lang w:eastAsia="zh-CN"/>
         </w:rPr>
       </w:pPr>
-      <w:permStart w:id="5" w:edGrp="everyone"/>
       <w:r>
         <w:rPr>
           <w:lang w:eastAsia="zh-CN"/>
@@ -1637,7 +2024,6 @@
         <w:t>10.4 一方提前解除合同的，应提前15日书面通知对方，给对方造成损失的，应承担赔偿责任。乙方提前解除合同的，应按未履行部分租期租金总额的____%向甲方支付违约金。</w:t>
       </w:r>
     </w:p>
-    <w:permEnd w:id="5"/>
     <w:p>
       <w:pPr>
         <w:pStyle w:val="7"/>
@@ -2159,15 +2545,24 @@
               <w:pStyle w:val="13"/>
               <w:jc w:val="center"/>
               <w:rPr>
+                <w:rFonts w:hint="eastAsia" w:eastAsia="宋体"/>
                 <w:highlight w:val="yellow"/>
+                <w:lang w:val="en-US" w:eastAsia="zh-CN"/>
               </w:rPr>
             </w:pPr>
-            <w:permStart w:id="6" w:edGrp="everyone"/>
             <w:r>
               <w:rPr>
                 <w:highlight w:val="yellow"/>
               </w:rPr>
               <w:t>甲方（盖章）：</w:t>
+            </w:r>
+            <w:r>
+              <w:rPr>
+                <w:rFonts w:hint="eastAsia"/>
+                <w:highlight w:val="yellow"/>
+                <w:lang w:val="en-US" w:eastAsia="zh-CN"/>
+              </w:rPr>
+              <w:t>阿萨德</w:t>
             </w:r>
           </w:p>
         </w:tc>
@@ -2180,7 +2575,9 @@
               <w:pStyle w:val="13"/>
               <w:jc w:val="center"/>
               <w:rPr>
+                <w:rFonts w:hint="eastAsia" w:eastAsia="宋体"/>
                 <w:highlight w:val="yellow"/>
+                <w:lang w:val="en-US" w:eastAsia="zh-CN"/>
               </w:rPr>
             </w:pPr>
             <w:r>
@@ -2188,6 +2585,170 @@
                 <w:highlight w:val="yellow"/>
               </w:rPr>
               <w:t>乙方（盖章）：</w:t>
+            </w:r>
+            <w:r>
+              <w:rPr>
+                <w:rFonts w:hint="eastAsia"/>
+                <w:highlight w:val="yellow"/>
+                <w:lang w:val="en-US" w:eastAsia="zh-CN"/>
+              </w:rPr>
+              <w:t>啊三大法宝</w:t>
+            </w:r>
+          </w:p>
+        </w:tc>
+      </w:tr>
+      <w:tr>
+        <w:tblPrEx>
+          <w:tblBorders>
+            <w:top w:val="single" w:color="auto" w:sz="4" w:space="0"/>
+            <w:left w:val="single" w:color="auto" w:sz="4" w:space="0"/>
+            <w:bottom w:val="single" w:color="auto" w:sz="4" w:space="0"/>
+            <w:right w:val="single" w:color="auto" w:sz="4" w:space="0"/>
+            <w:insideH w:val="single" w:color="auto" w:sz="4" w:space="0"/>
+            <w:insideV w:val="single" w:color="auto" w:sz="4" w:space="0"/>
+          </w:tblBorders>
+          <w:tblCellMar>
+            <w:top w:w="0" w:type="dxa"/>
+            <w:left w:w="108" w:type="dxa"/>
+            <w:bottom w:w="0" w:type="dxa"/>
+            <w:right w:w="108" w:type="dxa"/>
+          </w:tblCellMar>
+        </w:tblPrEx>
+        <w:tc>
+          <w:tcPr>
+            <w:tcW w:w="4320" w:type="dxa"/>
+          </w:tcPr>
+          <w:p>
+            <w:pPr>
+              <w:pStyle w:val="13"/>
+              <w:jc w:val="center"/>
+              <w:rPr>
+                <w:rFonts w:hint="eastAsia" w:eastAsia="宋体"/>
+                <w:highlight w:val="yellow"/>
+                <w:lang w:val="en-US" w:eastAsia="zh-CN"/>
+              </w:rPr>
+            </w:pPr>
+            <w:r>
+              <w:rPr>
+                <w:highlight w:val="yellow"/>
+              </w:rPr>
+              <w:t>法定代表人/负责人：</w:t>
+            </w:r>
+            <w:r>
+              <w:rPr>
+                <w:rFonts w:hint="eastAsia"/>
+                <w:highlight w:val="yellow"/>
+                <w:lang w:val="en-US" w:eastAsia="zh-CN"/>
+              </w:rPr>
+              <w:t>请按照</w:t>
+            </w:r>
+          </w:p>
+        </w:tc>
+        <w:tc>
+          <w:tcPr>
+            <w:tcW w:w="4320" w:type="dxa"/>
+          </w:tcPr>
+          <w:p>
+            <w:pPr>
+              <w:pStyle w:val="13"/>
+              <w:jc w:val="center"/>
+              <w:rPr>
+                <w:rFonts w:hint="eastAsia" w:eastAsia="宋体"/>
+                <w:highlight w:val="yellow"/>
+                <w:lang w:val="en-US" w:eastAsia="zh-CN"/>
+              </w:rPr>
+            </w:pPr>
+            <w:r>
+              <w:rPr>
+                <w:highlight w:val="yellow"/>
+              </w:rPr>
+              <w:t>法定代表人：</w:t>
+            </w:r>
+            <w:r>
+              <w:rPr>
+                <w:rFonts w:hint="eastAsia"/>
+                <w:highlight w:val="yellow"/>
+                <w:lang w:val="en-US" w:eastAsia="zh-CN"/>
+              </w:rPr>
+              <w:t>哦豁</w:t>
+            </w:r>
+          </w:p>
+        </w:tc>
+      </w:tr>
+      <w:tr>
+        <w:tblPrEx>
+          <w:tblBorders>
+            <w:top w:val="single" w:color="auto" w:sz="4" w:space="0"/>
+            <w:left w:val="single" w:color="auto" w:sz="4" w:space="0"/>
+            <w:bottom w:val="single" w:color="auto" w:sz="4" w:space="0"/>
+            <w:right w:val="single" w:color="auto" w:sz="4" w:space="0"/>
+            <w:insideH w:val="single" w:color="auto" w:sz="4" w:space="0"/>
+            <w:insideV w:val="single" w:color="auto" w:sz="4" w:space="0"/>
+          </w:tblBorders>
+          <w:tblCellMar>
+            <w:top w:w="0" w:type="dxa"/>
+            <w:left w:w="108" w:type="dxa"/>
+            <w:bottom w:w="0" w:type="dxa"/>
+            <w:right w:w="108" w:type="dxa"/>
+          </w:tblCellMar>
+        </w:tblPrEx>
+        <w:tc>
+          <w:tcPr>
+            <w:tcW w:w="4320" w:type="dxa"/>
+          </w:tcPr>
+          <w:p>
+            <w:pPr>
+              <w:pStyle w:val="13"/>
+              <w:jc w:val="center"/>
+              <w:rPr>
+                <w:rFonts w:hint="eastAsia" w:eastAsia="宋体"/>
+                <w:highlight w:val="yellow"/>
+                <w:lang w:val="en-US" w:eastAsia="zh-CN"/>
+              </w:rPr>
+            </w:pPr>
+            <w:r>
+              <w:rPr>
+                <w:highlight w:val="yellow"/>
+              </w:rPr>
+              <w:t>授权代理人：</w:t>
+            </w:r>
+            <w:r>
+              <w:rPr>
+                <w:rFonts w:hint="eastAsia"/>
+                <w:highlight w:val="yellow"/>
+                <w:lang w:val="en-US" w:eastAsia="zh-CN"/>
+              </w:rPr>
+              <w:t>阿斯顿</w:t>
+            </w:r>
+          </w:p>
+        </w:tc>
+        <w:tc>
+          <w:tcPr>
+            <w:tcW w:w="4320" w:type="dxa"/>
+          </w:tcPr>
+          <w:p>
+            <w:pPr>
+              <w:pStyle w:val="13"/>
+              <w:jc w:val="center"/>
+              <w:rPr>
+                <w:rFonts w:hint="eastAsia" w:eastAsia="宋体"/>
+                <w:highlight w:val="yellow"/>
+                <w:lang w:val="en-US" w:eastAsia="zh-CN"/>
+              </w:rPr>
+            </w:pPr>
+            <w:r>
+              <w:rPr>
+                <w:highlight w:val="yellow"/>
+              </w:rPr>
+              <w:t>授权代理人：</w:t>
+            </w:r>
+            <w:r>
+              <w:rPr>
+                <w:rFonts w:hint="eastAsia"/>
+                <w:highlight w:val="yellow"/>
+                <w:lang w:val="en-US" w:eastAsia="zh-CN"/>
+              </w:rPr>
+              <w:t>阿斗</w:t>
             </w:r>
           </w:p>
         </w:tc>
@@ -2225,123 +2786,35 @@
               <w:rPr>
                 <w:highlight w:val="yellow"/>
               </w:rPr>
-              <w:t>法定代表人/负责人：</w:t>
+              <w:t>日期：___</w:t>
             </w:r>
-          </w:p>
-        </w:tc>
-        <w:tc>
-          <w:tcPr>
-            <w:tcW w:w="4320" w:type="dxa"/>
-          </w:tcPr>
-          <w:p>
-            <w:pPr>
-              <w:pStyle w:val="13"/>
-              <w:jc w:val="center"/>
+            <w:r>
               <w:rPr>
+                <w:rFonts w:hint="eastAsia"/>
                 <w:highlight w:val="yellow"/>
+                <w:lang w:val="en-US" w:eastAsia="zh-CN"/>
               </w:rPr>
-            </w:pPr>
+              <w:t>2025</w:t>
+            </w:r>
             <w:r>
               <w:rPr>
                 <w:highlight w:val="yellow"/>
               </w:rPr>
-              <w:t>法定代表人：</w:t>
+              <w:t>___年__</w:t>
             </w:r>
-          </w:p>
-        </w:tc>
-      </w:tr>
-      <w:tr>
-        <w:tblPrEx>
-          <w:tblBorders>
-            <w:top w:val="single" w:color="auto" w:sz="4" w:space="0"/>
-            <w:left w:val="single" w:color="auto" w:sz="4" w:space="0"/>
-            <w:bottom w:val="single" w:color="auto" w:sz="4" w:space="0"/>
-            <w:right w:val="single" w:color="auto" w:sz="4" w:space="0"/>
-            <w:insideH w:val="single" w:color="auto" w:sz="4" w:space="0"/>
-            <w:insideV w:val="single" w:color="auto" w:sz="4" w:space="0"/>
-          </w:tblBorders>
-          <w:tblCellMar>
-            <w:top w:w="0" w:type="dxa"/>
-            <w:left w:w="108" w:type="dxa"/>
-            <w:bottom w:w="0" w:type="dxa"/>
-            <w:right w:w="108" w:type="dxa"/>
-          </w:tblCellMar>
-        </w:tblPrEx>
-        <w:tc>
-          <w:tcPr>
-            <w:tcW w:w="4320" w:type="dxa"/>
-          </w:tcPr>
-          <w:p>
-            <w:pPr>
-              <w:pStyle w:val="13"/>
-              <w:jc w:val="center"/>
+            <w:r>
               <w:rPr>
+                <w:rFonts w:hint="eastAsia"/>
                 <w:highlight w:val="yellow"/>
+                <w:lang w:val="en-US" w:eastAsia="zh-CN"/>
               </w:rPr>
-            </w:pPr>
+              <w:t>2</w:t>
+            </w:r>
             <w:r>
               <w:rPr>
                 <w:highlight w:val="yellow"/>
               </w:rPr>
-              <w:t>授权代理人：</w:t>
-            </w:r>
-          </w:p>
-        </w:tc>
-        <w:tc>
-          <w:tcPr>
-            <w:tcW w:w="4320" w:type="dxa"/>
-          </w:tcPr>
-          <w:p>
-            <w:pPr>
-              <w:pStyle w:val="13"/>
-              <w:jc w:val="center"/>
-              <w:rPr>
-                <w:highlight w:val="yellow"/>
-              </w:rPr>
-            </w:pPr>
-            <w:r>
-              <w:rPr>
-                <w:highlight w:val="yellow"/>
-              </w:rPr>
-              <w:t>授权代理人：</w:t>
-            </w:r>
-          </w:p>
-        </w:tc>
-      </w:tr>
-      <w:tr>
-        <w:tblPrEx>
-          <w:tblBorders>
-            <w:top w:val="single" w:color="auto" w:sz="4" w:space="0"/>
-            <w:left w:val="single" w:color="auto" w:sz="4" w:space="0"/>
-            <w:bottom w:val="single" w:color="auto" w:sz="4" w:space="0"/>
-            <w:right w:val="single" w:color="auto" w:sz="4" w:space="0"/>
-            <w:insideH w:val="single" w:color="auto" w:sz="4" w:space="0"/>
-            <w:insideV w:val="single" w:color="auto" w:sz="4" w:space="0"/>
-          </w:tblBorders>
-          <w:tblCellMar>
-            <w:top w:w="0" w:type="dxa"/>
-            <w:left w:w="108" w:type="dxa"/>
-            <w:bottom w:w="0" w:type="dxa"/>
-            <w:right w:w="108" w:type="dxa"/>
-          </w:tblCellMar>
-        </w:tblPrEx>
-        <w:tc>
-          <w:tcPr>
-            <w:tcW w:w="4320" w:type="dxa"/>
-          </w:tcPr>
-          <w:p>
-            <w:pPr>
-              <w:pStyle w:val="13"/>
-              <w:jc w:val="center"/>
-              <w:rPr>
-                <w:highlight w:val="yellow"/>
-              </w:rPr>
-            </w:pPr>
-            <w:r>
-              <w:rPr>
-                <w:highlight w:val="yellow"/>
-              </w:rPr>
-              <w:t>日期：______年____月____日</w:t>
+              <w:t>__月____日</w:t>
             </w:r>
           </w:p>
         </w:tc>
@@ -2366,7 +2839,6 @@
           </w:p>
         </w:tc>
       </w:tr>
-      <w:permEnd w:id="6"/>
     </w:tbl>
     <w:p/>
     <w:p/>

</xml_diff>